<commit_message>
paper §4.5: name the category — recognition without representation
Folds in the conceptual contribution the empirics circle: H1-positive (the model recognizes
barbarous-name-NESS) and decider-null (it holds no deep representation of a barbarous name AS a name)
are not a contradiction but a category — recognition WITHOUT representation, a knowing-that without a
knowing-what. Distinguishes discriminative early-layer recognition from held deep representation;
grounds it in §3.1-§3.4; gives analogues (face-detection before identity, sonnet-by-cadence,
handwriting-as-theirs) with restraint (a framing the evidence supports, not a new measurement); notes
the voces are an unusually clean instance because they are meaning-evacuated by design. Tied into the
abstract + README; docx regenerated.

(Surfaced in the /pedagogy seminar via the student Sam's question — teaching produced the noun the
empirics were missing.)

Co-Authored-By: Claude Opus 4.8 (1M context) <noreply@anthropic.com>
</commit_message>
<xml_diff>
--- a/paper/its-the-script-not-the-spell-v2-crossfamily.docx
+++ b/paper/its-the-script-not-the-spell-v2-crossfamily.docx
@@ -10,7 +10,7 @@
         <w:t xml:space="preserve">The Texture of the Barbarous Name</w:t>
       </w:r>
     </w:p>
-    <w:bookmarkStart w:id="33" w:name="the-texture-of-the-barbarous-name"/>
+    <w:bookmarkStart w:id="34" w:name="the-texture-of-the-barbarous-name"/>
     <w:p>
       <w:pPr>
         <w:pStyle w:val="Heading1"/>
@@ -862,7 +862,29 @@
         <w:t xml:space="preserve"> </w:t>
       </w:r>
       <w:r>
-        <w:t xml:space="preserve">real, surface, general — not aboutness.</w:t>
+        <w:t xml:space="preserve">real, surface, general — not aboutness:</w:t>
+      </w:r>
+      <w:r>
+        <w:t xml:space="preserve"> </w:t>
+      </w:r>
+      <w:r>
+        <w:rPr>
+          <w:bCs/>
+          <w:b/>
+        </w:rPr>
+        <w:t xml:space="preserve">recognition without representation</w:t>
+      </w:r>
+      <w:r>
+        <w:t xml:space="preserve"> </w:t>
+      </w:r>
+      <w:r>
+        <w:t xml:space="preserve">(§4.5), a knowing-that without a</w:t>
+      </w:r>
+      <w:r>
+        <w:t xml:space="preserve"> </w:t>
+      </w:r>
+      <w:r>
+        <w:t xml:space="preserve">knowing-what, of which these meaning-evacuated strings are an unusually clean instance.</w:t>
       </w:r>
     </w:p>
     <w:p>
@@ -5275,7 +5297,7 @@
     </w:p>
     <w:bookmarkEnd w:id="27"/>
     <w:bookmarkEnd w:id="28"/>
-    <w:bookmarkStart w:id="29" w:name="what-the-model-does-and-the-bound-on-it"/>
+    <w:bookmarkStart w:id="30" w:name="what-the-model-does-and-the-bound-on-it"/>
     <w:p>
       <w:pPr>
         <w:pStyle w:val="Heading2"/>
@@ -5710,8 +5732,571 @@
         <w:t xml:space="preserve">recognition, stands clearer for having the depth explained out from under it.</w:t>
       </w:r>
     </w:p>
+    <w:bookmarkStart w:id="29" w:name="recognition-without-representation"/>
+    <w:p>
+      <w:pPr>
+        <w:pStyle w:val="Heading3"/>
+      </w:pPr>
+      <w:r>
+        <w:t xml:space="preserve">4.5 Recognition without representation</w:t>
+      </w:r>
+    </w:p>
+    <w:p>
+      <w:pPr>
+        <w:pStyle w:val="FirstParagraph"/>
+      </w:pPr>
+      <w:r>
+        <w:t xml:space="preserve">The two load-bearing results point in apparently opposite directions, and the tension is only apparent.</w:t>
+      </w:r>
+      <w:r>
+        <w:t xml:space="preserve"> </w:t>
+      </w:r>
+      <w:r>
+        <w:rPr>
+          <w:bCs/>
+          <w:b/>
+        </w:rPr>
+        <w:t xml:space="preserve">H1 is</w:t>
+      </w:r>
+      <w:r>
+        <w:rPr>
+          <w:bCs/>
+          <w:b/>
+        </w:rPr>
+        <w:t xml:space="preserve"> </w:t>
+      </w:r>
+      <w:r>
+        <w:rPr>
+          <w:bCs/>
+          <w:b/>
+        </w:rPr>
+        <w:t xml:space="preserve">positive: the model recognizes barbarous-name-</w:t>
+      </w:r>
+      <w:r>
+        <w:rPr>
+          <w:iCs/>
+          <w:i/>
+          <w:bCs/>
+          <w:b/>
+        </w:rPr>
+        <w:t xml:space="preserve">ness</w:t>
+      </w:r>
+      <w:r>
+        <w:rPr>
+          <w:bCs/>
+          <w:b/>
+        </w:rPr>
+        <w:t xml:space="preserve">.</w:t>
+      </w:r>
+      <w:r>
+        <w:t xml:space="preserve"> </w:t>
+      </w:r>
+      <w:r>
+        <w:rPr>
+          <w:bCs/>
+          <w:b/>
+        </w:rPr>
+        <w:t xml:space="preserve">The decider is null: the model holds no deep</w:t>
+      </w:r>
+      <w:r>
+        <w:rPr>
+          <w:bCs/>
+          <w:b/>
+        </w:rPr>
+        <w:t xml:space="preserve"> </w:t>
+      </w:r>
+      <w:r>
+        <w:rPr>
+          <w:bCs/>
+          <w:b/>
+        </w:rPr>
+        <w:t xml:space="preserve">representation of a barbarous name</w:t>
+      </w:r>
+      <w:r>
+        <w:rPr>
+          <w:bCs/>
+          <w:b/>
+        </w:rPr>
+        <w:t xml:space="preserve"> </w:t>
+      </w:r>
+      <w:r>
+        <w:rPr>
+          <w:iCs/>
+          <w:i/>
+          <w:bCs/>
+          <w:b/>
+        </w:rPr>
+        <w:t xml:space="preserve">as a name</w:t>
+      </w:r>
+      <w:r>
+        <w:rPr>
+          <w:bCs/>
+          <w:b/>
+        </w:rPr>
+        <w:t xml:space="preserve">.</w:t>
+      </w:r>
+      <w:r>
+        <w:t xml:space="preserve"> </w:t>
+      </w:r>
+      <w:r>
+        <w:t xml:space="preserve">Stated as a contradiction, that reads as</w:t>
+      </w:r>
+      <w:r>
+        <w:t xml:space="preserve"> </w:t>
+      </w:r>
+      <w:r>
+        <w:t xml:space="preserve">“</w:t>
+      </w:r>
+      <w:r>
+        <w:t xml:space="preserve">it knows them and it</w:t>
+      </w:r>
+      <w:r>
+        <w:t xml:space="preserve"> </w:t>
+      </w:r>
+      <w:r>
+        <w:t xml:space="preserve">doesn’t.</w:t>
+      </w:r>
+      <w:r>
+        <w:t xml:space="preserve">”</w:t>
+      </w:r>
+      <w:r>
+        <w:t xml:space="preserve"> </w:t>
+      </w:r>
+      <w:r>
+        <w:t xml:space="preserve">Stated precisely, it names a category the empirics have been circling all along —</w:t>
+      </w:r>
+      <w:r>
+        <w:t xml:space="preserve"> </w:t>
+      </w:r>
+      <w:r>
+        <w:rPr>
+          <w:bCs/>
+          <w:b/>
+        </w:rPr>
+        <w:t xml:space="preserve">recognition</w:t>
+      </w:r>
+      <w:r>
+        <w:rPr>
+          <w:bCs/>
+          <w:b/>
+        </w:rPr>
+        <w:t xml:space="preserve"> </w:t>
+      </w:r>
+      <w:r>
+        <w:rPr>
+          <w:bCs/>
+          <w:b/>
+        </w:rPr>
+        <w:t xml:space="preserve">without representation.</w:t>
+      </w:r>
+    </w:p>
+    <w:p>
+      <w:pPr>
+        <w:pStyle w:val="BodyText"/>
+      </w:pPr>
+      <w:r>
+        <w:t xml:space="preserve">The distinction is worth making sharp, because the two words are usually run together.</w:t>
+      </w:r>
+      <w:r>
+        <w:t xml:space="preserve"> </w:t>
+      </w:r>
+      <w:r>
+        <w:rPr>
+          <w:iCs/>
+          <w:i/>
+        </w:rPr>
+        <w:t xml:space="preserve">Recognition</w:t>
+      </w:r>
+      <w:r>
+        <w:t xml:space="preserve">, as we</w:t>
+      </w:r>
+      <w:r>
+        <w:t xml:space="preserve"> </w:t>
+      </w:r>
+      <w:r>
+        <w:t xml:space="preserve">measure it, is a discriminative signature: a classifier can separate the voces from token-matched nonsense from</w:t>
+      </w:r>
+      <w:r>
+        <w:t xml:space="preserve"> </w:t>
+      </w:r>
+      <w:r>
+        <w:t xml:space="preserve">the early-layer activations (H1). It is</w:t>
+      </w:r>
+      <w:r>
+        <w:t xml:space="preserve"> </w:t>
+      </w:r>
+      <w:r>
+        <w:rPr>
+          <w:iCs/>
+          <w:i/>
+        </w:rPr>
+        <w:t xml:space="preserve">recognition-that</w:t>
+      </w:r>
+      <w:r>
+        <w:t xml:space="preserve"> </w:t>
+      </w:r>
+      <w:r>
+        <w:t xml:space="preserve">— that this string is of the barbarous-name kind — and</w:t>
+      </w:r>
+      <w:r>
+        <w:t xml:space="preserve"> </w:t>
+      </w:r>
+      <w:r>
+        <w:t xml:space="preserve">it is read off the surface, on sight, without anything further being built.</w:t>
+      </w:r>
+      <w:r>
+        <w:t xml:space="preserve"> </w:t>
+      </w:r>
+      <w:r>
+        <w:rPr>
+          <w:iCs/>
+          <w:i/>
+        </w:rPr>
+        <w:t xml:space="preserve">Representation</w:t>
+      </w:r>
+      <w:r>
+        <w:t xml:space="preserve">, as the decider</w:t>
+      </w:r>
+      <w:r>
+        <w:t xml:space="preserve"> </w:t>
+      </w:r>
+      <w:r>
+        <w:t xml:space="preserve">probes for it, is a held, content-bearing deep state: a place where the network would carry the voces</w:t>
+      </w:r>
+      <w:r>
+        <w:t xml:space="preserve"> </w:t>
+      </w:r>
+      <w:r>
+        <w:rPr>
+          <w:iCs/>
+          <w:i/>
+        </w:rPr>
+        <w:t xml:space="preserve">as</w:t>
+      </w:r>
+      <w:r>
+        <w:rPr>
+          <w:iCs/>
+          <w:i/>
+        </w:rPr>
+        <w:t xml:space="preserve"> </w:t>
+      </w:r>
+      <w:r>
+        <w:rPr>
+          <w:iCs/>
+          <w:i/>
+        </w:rPr>
+        <w:t xml:space="preserve">names-of-power</w:t>
+      </w:r>
+      <w:r>
+        <w:t xml:space="preserve">, distinguishably from fragmentation-matched controls, into the layers where abstraction lives. It</w:t>
+      </w:r>
+      <w:r>
+        <w:t xml:space="preserve"> </w:t>
+      </w:r>
+      <w:r>
+        <w:t xml:space="preserve">is</w:t>
+      </w:r>
+      <w:r>
+        <w:t xml:space="preserve"> </w:t>
+      </w:r>
+      <w:r>
+        <w:rPr>
+          <w:iCs/>
+          <w:i/>
+        </w:rPr>
+        <w:t xml:space="preserve">representation-of</w:t>
+      </w:r>
+      <w:r>
+        <w:t xml:space="preserve"> </w:t>
+      </w:r>
+      <w:r>
+        <w:t xml:space="preserve">— a what, not just a that.</w:t>
+      </w:r>
+      <w:r>
+        <w:t xml:space="preserve"> </w:t>
+      </w:r>
+      <w:r>
+        <w:rPr>
+          <w:bCs/>
+          <w:b/>
+        </w:rPr>
+        <w:t xml:space="preserve">The model has the first and not the second.</w:t>
+      </w:r>
+      <w:r>
+        <w:t xml:space="preserve"> </w:t>
+      </w:r>
+      <w:r>
+        <w:t xml:space="preserve">It recognizes</w:t>
+      </w:r>
+      <w:r>
+        <w:t xml:space="preserve"> </w:t>
+      </w:r>
+      <w:r>
+        <w:t xml:space="preserve">the category without ever representing a member of it as the thing the category is named for; and §3.4 shows it</w:t>
+      </w:r>
+      <w:r>
+        <w:t xml:space="preserve"> </w:t>
+      </w:r>
+      <w:r>
+        <w:t xml:space="preserve">does not even hold them as</w:t>
+      </w:r>
+      <w:r>
+        <w:t xml:space="preserve"> </w:t>
+      </w:r>
+      <w:r>
+        <w:rPr>
+          <w:iCs/>
+          <w:i/>
+        </w:rPr>
+        <w:t xml:space="preserve">special</w:t>
+      </w:r>
+      <w:r>
+        <w:t xml:space="preserve"> </w:t>
+      </w:r>
+      <w:r>
+        <w:t xml:space="preserve">down there — at matched fragmentation the voces sit</w:t>
+      </w:r>
+      <w:r>
+        <w:t xml:space="preserve"> </w:t>
+      </w:r>
+      <w:r>
+        <w:rPr>
+          <w:iCs/>
+          <w:i/>
+        </w:rPr>
+        <w:t xml:space="preserve">below</w:t>
+      </w:r>
+      <w:r>
+        <w:t xml:space="preserve"> </w:t>
+      </w:r>
+      <w:r>
+        <w:t xml:space="preserve">the noise,</w:t>
+      </w:r>
+      <w:r>
+        <w:t xml:space="preserve"> </w:t>
+      </w:r>
+      <w:r>
+        <w:t xml:space="preserve">precisely because recognition (which fires in both scripts, for anything name-textured) pulls them off the</w:t>
+      </w:r>
+      <w:r>
+        <w:t xml:space="preserve"> </w:t>
+      </w:r>
+      <w:r>
+        <w:t xml:space="preserve">deep-fragmentation peak that pure-novelty occupies.</w:t>
+      </w:r>
+    </w:p>
+    <w:p>
+      <w:pPr>
+        <w:pStyle w:val="BodyText"/>
+      </w:pPr>
+      <w:r>
+        <w:t xml:space="preserve">This is not a deficiency of the model; it is a</w:t>
+      </w:r>
+      <w:r>
+        <w:t xml:space="preserve"> </w:t>
+      </w:r>
+      <w:r>
+        <w:rPr>
+          <w:iCs/>
+          <w:i/>
+        </w:rPr>
+        <w:t xml:space="preserve">kind</w:t>
+      </w:r>
+      <w:r>
+        <w:t xml:space="preserve"> </w:t>
+      </w:r>
+      <w:r>
+        <w:t xml:space="preserve">of knowing, and a common one. It is the structure of</w:t>
+      </w:r>
+      <w:r>
+        <w:t xml:space="preserve"> </w:t>
+      </w:r>
+      <w:r>
+        <w:t xml:space="preserve">face-detection that registers</w:t>
+      </w:r>
+      <w:r>
+        <w:t xml:space="preserve"> </w:t>
+      </w:r>
+      <w:r>
+        <w:rPr>
+          <w:iCs/>
+          <w:i/>
+        </w:rPr>
+        <w:t xml:space="preserve">a face</w:t>
+      </w:r>
+      <w:r>
+        <w:t xml:space="preserve"> </w:t>
+      </w:r>
+      <w:r>
+        <w:t xml:space="preserve">before any identity is bound; of hearing</w:t>
+      </w:r>
+      <w:r>
+        <w:t xml:space="preserve"> </w:t>
+      </w:r>
+      <w:r>
+        <w:rPr>
+          <w:iCs/>
+          <w:i/>
+        </w:rPr>
+        <w:t xml:space="preserve">a sonnet</w:t>
+      </w:r>
+      <w:r>
+        <w:t xml:space="preserve"> </w:t>
+      </w:r>
+      <w:r>
+        <w:t xml:space="preserve">by its cadence before</w:t>
+      </w:r>
+      <w:r>
+        <w:t xml:space="preserve"> </w:t>
+      </w:r>
+      <w:r>
+        <w:t xml:space="preserve">parsing a line; of knowing a friend’s handwriting as theirs without reading the word. Each is genuine</w:t>
+      </w:r>
+      <w:r>
+        <w:t xml:space="preserve"> </w:t>
+      </w:r>
+      <w:r>
+        <w:t xml:space="preserve">recognition with no semantic representation underneath —</w:t>
+      </w:r>
+      <w:r>
+        <w:t xml:space="preserve"> </w:t>
+      </w:r>
+      <w:r>
+        <w:rPr>
+          <w:iCs/>
+          <w:i/>
+        </w:rPr>
+        <w:t xml:space="preserve">knowing-that without knowing-what.</w:t>
+      </w:r>
+      <w:r>
+        <w:t xml:space="preserve"> </w:t>
+      </w:r>
+      <w:r>
+        <w:t xml:space="preserve">The voces are an</w:t>
+      </w:r>
+      <w:r>
+        <w:t xml:space="preserve"> </w:t>
+      </w:r>
+      <w:r>
+        <w:t xml:space="preserve">unusually clean instance because they are</w:t>
+      </w:r>
+      <w:r>
+        <w:t xml:space="preserve"> </w:t>
+      </w:r>
+      <w:r>
+        <w:rPr>
+          <w:iCs/>
+          <w:i/>
+        </w:rPr>
+        <w:t xml:space="preserve">built</w:t>
+      </w:r>
+      <w:r>
+        <w:t xml:space="preserve"> </w:t>
+      </w:r>
+      <w:r>
+        <w:t xml:space="preserve">to have no</w:t>
+      </w:r>
+      <w:r>
+        <w:t xml:space="preserve"> </w:t>
+      </w:r>
+      <w:r>
+        <w:t xml:space="preserve">“</w:t>
+      </w:r>
+      <w:r>
+        <w:t xml:space="preserve">what</w:t>
+      </w:r>
+      <w:r>
+        <w:t xml:space="preserve">”</w:t>
+      </w:r>
+      <w:r>
+        <w:t xml:space="preserve">: meaning-evacuated by design, they can only</w:t>
+      </w:r>
+      <w:r>
+        <w:t xml:space="preserve"> </w:t>
+      </w:r>
+      <w:r>
+        <w:t xml:space="preserve">ever be recognized, never represented-as-meaning, and so they isolate the recognition-without-representation</w:t>
+      </w:r>
+      <w:r>
+        <w:t xml:space="preserve"> </w:t>
+      </w:r>
+      <w:r>
+        <w:t xml:space="preserve">relation in pure form. That is also why they are the right probe, and why the magicians’ premise survives the</w:t>
+      </w:r>
+      <w:r>
+        <w:t xml:space="preserve"> </w:t>
+      </w:r>
+      <w:r>
+        <w:t xml:space="preserve">test exactly as far as it was ever testable: they said these words do their work by</w:t>
+      </w:r>
+      <w:r>
+        <w:t xml:space="preserve"> </w:t>
+      </w:r>
+      <w:r>
+        <w:rPr>
+          <w:iCs/>
+          <w:i/>
+        </w:rPr>
+        <w:t xml:space="preserve">form</w:t>
+      </w:r>
+      <w:r>
+        <w:t xml:space="preserve">, and a form-processor</w:t>
+      </w:r>
+      <w:r>
+        <w:t xml:space="preserve"> </w:t>
+      </w:r>
+      <w:r>
+        <w:t xml:space="preserve">recognizes the form — fully, generally — while representing no name at all.</w:t>
+      </w:r>
+    </w:p>
+    <w:p>
+      <w:pPr>
+        <w:pStyle w:val="BodyText"/>
+      </w:pPr>
+      <w:r>
+        <w:t xml:space="preserve">We offer this as a</w:t>
+      </w:r>
+      <w:r>
+        <w:t xml:space="preserve"> </w:t>
+      </w:r>
+      <w:r>
+        <w:rPr>
+          <w:iCs/>
+          <w:i/>
+        </w:rPr>
+        <w:t xml:space="preserve">framing the present evidence supports</w:t>
+      </w:r>
+      <w:r>
+        <w:t xml:space="preserve">, not as a new measurement: the framing is what makes</w:t>
+      </w:r>
+      <w:r>
+        <w:t xml:space="preserve"> </w:t>
+      </w:r>
+      <w:r>
+        <w:t xml:space="preserve">H1-positive and decider-null cohere rather than conflict. The empirical claims are §3.1–§3.4; §4.5 only names</w:t>
+      </w:r>
+      <w:r>
+        <w:t xml:space="preserve"> </w:t>
+      </w:r>
+      <w:r>
+        <w:t xml:space="preserve">what they are jointly a portrait of. (It also marks the cleanest open question for future work — whether</w:t>
+      </w:r>
+      <w:r>
+        <w:t xml:space="preserve"> </w:t>
+      </w:r>
+      <w:r>
+        <w:t xml:space="preserve">recognition-without-representation, isolated here in meaning-evacuated strings, characterizes a broader class of</w:t>
+      </w:r>
+      <w:r>
+        <w:t xml:space="preserve"> </w:t>
+      </w:r>
+      <w:r>
+        <w:t xml:space="preserve">the model’s early-layer category detectors.)</w:t>
+      </w:r>
+    </w:p>
     <w:bookmarkEnd w:id="29"/>
-    <w:bookmarkStart w:id="30" w:name="the-honest-hedges"/>
+    <w:bookmarkEnd w:id="30"/>
+    <w:bookmarkStart w:id="31" w:name="the-honest-hedges"/>
     <w:p>
       <w:pPr>
         <w:pStyle w:val="Heading2"/>
@@ -6519,8 +7104,8 @@
         <w:t xml:space="preserve">, identical SP model).</w:t>
       </w:r>
     </w:p>
-    <w:bookmarkEnd w:id="30"/>
-    <w:bookmarkStart w:id="31" w:name="X81f6b025ddc38e408393bc0e336f8a05c8f5942"/>
+    <w:bookmarkEnd w:id="31"/>
+    <w:bookmarkStart w:id="32" w:name="X81f6b025ddc38e408393bc0e336f8a05c8f5942"/>
     <w:p>
       <w:pPr>
         <w:pStyle w:val="Heading2"/>
@@ -7014,8 +7599,8 @@
         </w:pict>
       </w:r>
     </w:p>
-    <w:bookmarkEnd w:id="31"/>
-    <w:bookmarkStart w:id="32" w:name="references"/>
+    <w:bookmarkEnd w:id="32"/>
+    <w:bookmarkStart w:id="33" w:name="references"/>
     <w:p>
       <w:pPr>
         <w:pStyle w:val="Heading2"/>
@@ -7321,8 +7906,8 @@
         <w:t xml:space="preserve">method.</w:t>
       </w:r>
     </w:p>
-    <w:bookmarkEnd w:id="32"/>
     <w:bookmarkEnd w:id="33"/>
+    <w:bookmarkEnd w:id="34"/>
     <w:sectPr/>
   </w:body>
 </w:document>

</xml_diff>